<commit_message>
Updated assignment with final screenshot
</commit_message>
<xml_diff>
--- a/module-1/Garcia-Assignment1_2.docx
+++ b/module-1/Garcia-Assignment1_2.docx
@@ -20,6 +20,9 @@
     <w:p/>
     <w:p>
       <w:r>
+        <w:rPr>
+          <w:noProof/>
+        </w:rPr>
         <w:drawing>
           <wp:inline distT="0" distB="0" distL="0" distR="0" wp14:anchorId="7FC71677" wp14:editId="4EFCC44D">
             <wp:extent cx="5943600" cy="4284345"/>
@@ -96,13 +99,8 @@
     </w:p>
     <w:p>
       <w:r>
-        <w:t xml:space="preserve">PS C:\csd&gt; </w:t>
-      </w:r>
-      <w:proofErr w:type="spellStart"/>
-      <w:r>
-        <w:t>dir</w:t>
-      </w:r>
-      <w:proofErr w:type="spellEnd"/>
+        <w:t>PS C:\csd&gt; dir</w:t>
+      </w:r>
     </w:p>
     <w:p/>
     <w:p/>
@@ -115,15 +113,7 @@
     <w:p/>
     <w:p>
       <w:r>
-        <w:t xml:space="preserve">Mode                 </w:t>
-      </w:r>
-      <w:proofErr w:type="spellStart"/>
-      <w:r>
-        <w:t>LastWriteTime</w:t>
-      </w:r>
-      <w:proofErr w:type="spellEnd"/>
-      <w:r>
-        <w:t xml:space="preserve">         Length Name</w:t>
+        <w:t>Mode                 LastWriteTime         Length Name</w:t>
       </w:r>
     </w:p>
     <w:p>
@@ -159,15 +149,7 @@
     </w:p>
     <w:p>
       <w:r>
-        <w:t xml:space="preserve">PS C:\csd\csd-310&gt; </w:t>
-      </w:r>
-      <w:proofErr w:type="spellStart"/>
-      <w:r>
-        <w:t>mkdir</w:t>
-      </w:r>
-      <w:proofErr w:type="spellEnd"/>
-      <w:r>
-        <w:t xml:space="preserve"> module-1</w:t>
+        <w:t>PS C:\csd\csd-310&gt; mkdir module-1</w:t>
       </w:r>
     </w:p>
     <w:p/>
@@ -181,15 +163,7 @@
     <w:p/>
     <w:p>
       <w:r>
-        <w:t xml:space="preserve">Mode                 </w:t>
-      </w:r>
-      <w:proofErr w:type="spellStart"/>
-      <w:r>
-        <w:t>LastWriteTime</w:t>
-      </w:r>
-      <w:proofErr w:type="spellEnd"/>
-      <w:r>
-        <w:t xml:space="preserve">         Length Name</w:t>
+        <w:t>Mode                 LastWriteTime         Length Name</w:t>
       </w:r>
     </w:p>
     <w:p>
@@ -215,13 +189,8 @@
     <w:p/>
     <w:p>
       <w:r>
-        <w:t xml:space="preserve">PS C:\csd\csd-310&gt; </w:t>
-      </w:r>
-      <w:proofErr w:type="spellStart"/>
-      <w:r>
-        <w:t>dir</w:t>
-      </w:r>
-      <w:proofErr w:type="spellEnd"/>
+        <w:t>PS C:\csd\csd-310&gt; dir</w:t>
+      </w:r>
     </w:p>
     <w:p/>
     <w:p/>
@@ -234,15 +203,7 @@
     <w:p/>
     <w:p>
       <w:r>
-        <w:t xml:space="preserve">Mode                 </w:t>
-      </w:r>
-      <w:proofErr w:type="spellStart"/>
-      <w:r>
-        <w:t>LastWriteTime</w:t>
-      </w:r>
-      <w:proofErr w:type="spellEnd"/>
-      <w:r>
-        <w:t xml:space="preserve">         Length Name</w:t>
+        <w:t>Mode                 LastWriteTime         Length Name</w:t>
       </w:r>
     </w:p>
     <w:p>
@@ -269,13 +230,8 @@
       </w:r>
       <w:proofErr w:type="gramStart"/>
       <w:r>
-        <w:t>4846 .</w:t>
-      </w:r>
-      <w:proofErr w:type="spellStart"/>
-      <w:r>
-        <w:t>gitignore</w:t>
-      </w:r>
-      <w:proofErr w:type="spellEnd"/>
+        <w:t>4846 .gitignore</w:t>
+      </w:r>
       <w:proofErr w:type="gramEnd"/>
     </w:p>
     <w:p>
@@ -302,16 +258,9 @@
       </w:r>
     </w:p>
     <w:p>
-      <w:proofErr w:type="gramStart"/>
-      <w:r>
-        <w:t>.</w:t>
-      </w:r>
-      <w:proofErr w:type="spellStart"/>
-      <w:r>
-        <w:t>gitignore</w:t>
-      </w:r>
-      <w:proofErr w:type="spellEnd"/>
-      <w:proofErr w:type="gramEnd"/>
+      <w:r>
+        <w:t>.gitignore</w:t>
+      </w:r>
     </w:p>
     <w:p>
       <w:r>
@@ -328,8 +277,48 @@
         </w:r>
       </w:hyperlink>
     </w:p>
+    <w:p>
+      <w:r>
+        <w:lastRenderedPageBreak/>
+        <w:drawing>
+          <wp:inline distT="0" distB="0" distL="0" distR="0" wp14:anchorId="4057DD94" wp14:editId="06B3C3C6">
+            <wp:extent cx="5943600" cy="2505075"/>
+            <wp:effectExtent l="0" t="0" r="0" b="9525"/>
+            <wp:docPr id="1994120636" name="Picture 1"/>
+            <wp:cNvGraphicFramePr>
+              <a:graphicFrameLocks xmlns:a="http://schemas.openxmlformats.org/drawingml/2006/main" noChangeAspect="1"/>
+            </wp:cNvGraphicFramePr>
+            <a:graphic xmlns:a="http://schemas.openxmlformats.org/drawingml/2006/main">
+              <a:graphicData uri="http://schemas.openxmlformats.org/drawingml/2006/picture">
+                <pic:pic xmlns:pic="http://schemas.openxmlformats.org/drawingml/2006/picture">
+                  <pic:nvPicPr>
+                    <pic:cNvPr id="1994120636" name=""/>
+                    <pic:cNvPicPr/>
+                  </pic:nvPicPr>
+                  <pic:blipFill>
+                    <a:blip r:embed="rId8"/>
+                    <a:stretch>
+                      <a:fillRect/>
+                    </a:stretch>
+                  </pic:blipFill>
+                  <pic:spPr>
+                    <a:xfrm>
+                      <a:off x="0" y="0"/>
+                      <a:ext cx="5943600" cy="2505075"/>
+                    </a:xfrm>
+                    <a:prstGeom prst="rect">
+                      <a:avLst/>
+                    </a:prstGeom>
+                  </pic:spPr>
+                </pic:pic>
+              </a:graphicData>
+            </a:graphic>
+          </wp:inline>
+        </w:drawing>
+      </w:r>
+    </w:p>
     <w:sectPr>
-      <w:headerReference w:type="default" r:id="rId8"/>
+      <w:headerReference w:type="default" r:id="rId9"/>
       <w:pgSz w:w="12240" w:h="15840"/>
       <w:pgMar w:top="1440" w:right="1440" w:bottom="1440" w:left="1440" w:header="720" w:footer="720" w:gutter="0"/>
       <w:cols w:space="720"/>
@@ -1022,6 +1011,7 @@
   <w:style w:type="character" w:default="1" w:styleId="DefaultParagraphFont">
     <w:name w:val="Default Paragraph Font"/>
     <w:uiPriority w:val="1"/>
+    <w:semiHidden/>
     <w:unhideWhenUsed/>
   </w:style>
   <w:style w:type="table" w:default="1" w:styleId="TableNormal">

</xml_diff>